<commit_message>
docs: Gantt final con responsables, indice de planificacion y ediciones de metodologias/riesgos
</commit_message>
<xml_diff>
--- a/Documentacion del desarrollo/Sprints/Matriz y Clasificacion de Riesgos - Sistema Wellness (1).docx
+++ b/Documentacion del desarrollo/Sprints/Matriz y Clasificacion de Riesgos - Sistema Wellness (1).docx
@@ -2099,7 +2099,21 @@
           <w:sz w:val="18"/>
           <w:szCs w:val="18"/>
         </w:rPr>
-        <w:t>La siguiente estructura organiza las amenazas potenciales según los estándares metodológicos de la Ingeniería de Software, proveyendo un caso práctico aplicable de forma unívoca a la solución Wellness planteada.</w:t>
+        <w:t xml:space="preserve">La siguiente estructura organiza las amenazas potenciales según los estándares metodológicos de la Ingeniería de Software, proveyendo un caso práctico aplicable de forma unívoca a la solución </w:t>
+      </w:r>
+      <w:r>
+        <w:rPr>
+          <w:sz w:val="18"/>
+          <w:szCs w:val="18"/>
+        </w:rPr>
+        <w:t>Runwell</w:t>
+      </w:r>
+      <w:r>
+        <w:rPr>
+          <w:sz w:val="18"/>
+          <w:szCs w:val="18"/>
+        </w:rPr>
+        <w:t xml:space="preserve"> planteada.</w:t>
       </w:r>
     </w:p>
     <w:tbl>

</xml_diff>